<commit_message>
starting to implement the gpt network
</commit_message>
<xml_diff>
--- a/documents/research log.docx
+++ b/documents/research log.docx
@@ -57,7 +57,63 @@
         <w:rPr>
           <w:lang w:val="en-GB"/>
         </w:rPr>
-        <w:t xml:space="preserve"> I think that the coordinate aware embeddings will be the best improvement but I will check wether the improvement then came only from this or for example dropout made it worse but dropout+coordinate aware embeddings still yield an improvement.</w:t>
+        <w:t xml:space="preserve"> I think that the coordinate aware embeddings will be the best </w:t>
+      </w:r>
+      <w:proofErr w:type="gramStart"/>
+      <w:r>
+        <w:rPr>
+          <w:lang w:val="en-GB"/>
+        </w:rPr>
+        <w:t>improvement</w:t>
+      </w:r>
+      <w:proofErr w:type="gramEnd"/>
+      <w:r>
+        <w:rPr>
+          <w:lang w:val="en-GB"/>
+        </w:rPr>
+        <w:t xml:space="preserve"> but I will check </w:t>
+      </w:r>
+      <w:proofErr w:type="spellStart"/>
+      <w:r>
+        <w:rPr>
+          <w:lang w:val="en-GB"/>
+        </w:rPr>
+        <w:t>wether</w:t>
+      </w:r>
+      <w:proofErr w:type="spellEnd"/>
+      <w:r>
+        <w:rPr>
+          <w:lang w:val="en-GB"/>
+        </w:rPr>
+        <w:t xml:space="preserve"> the improvement then came only from this or for example dropout made it </w:t>
+      </w:r>
+      <w:proofErr w:type="gramStart"/>
+      <w:r>
+        <w:rPr>
+          <w:lang w:val="en-GB"/>
+        </w:rPr>
+        <w:t>worse</w:t>
+      </w:r>
+      <w:proofErr w:type="gramEnd"/>
+      <w:r>
+        <w:rPr>
+          <w:lang w:val="en-GB"/>
+        </w:rPr>
+        <w:t xml:space="preserve"> but </w:t>
+      </w:r>
+      <w:proofErr w:type="spellStart"/>
+      <w:r>
+        <w:rPr>
+          <w:lang w:val="en-GB"/>
+        </w:rPr>
+        <w:t>dropout+coordinate</w:t>
+      </w:r>
+      <w:proofErr w:type="spellEnd"/>
+      <w:r>
+        <w:rPr>
+          <w:lang w:val="en-GB"/>
+        </w:rPr>
+        <w:t xml:space="preserve"> aware embeddings still yield an improvement.</w:t>
       </w:r>
     </w:p>
     <w:p>
@@ -115,7 +171,35 @@
         <w:rPr>
           <w:lang w:val="en-GB"/>
         </w:rPr>
-        <w:t>) it says that we should do this, and also in the original gpt implementation it said that we should add it in the mlp class not only in the block class (“</w:t>
+        <w:t xml:space="preserve">) it says that we should do this, and also in the original </w:t>
+      </w:r>
+      <w:proofErr w:type="spellStart"/>
+      <w:r>
+        <w:rPr>
+          <w:lang w:val="en-GB"/>
+        </w:rPr>
+        <w:t>gpt</w:t>
+      </w:r>
+      <w:proofErr w:type="spellEnd"/>
+      <w:r>
+        <w:rPr>
+          <w:lang w:val="en-GB"/>
+        </w:rPr>
+        <w:t xml:space="preserve"> implementation it said that we should add it in the </w:t>
+      </w:r>
+      <w:proofErr w:type="spellStart"/>
+      <w:r>
+        <w:rPr>
+          <w:lang w:val="en-GB"/>
+        </w:rPr>
+        <w:t>mlp</w:t>
+      </w:r>
+      <w:proofErr w:type="spellEnd"/>
+      <w:r>
+        <w:rPr>
+          <w:lang w:val="en-GB"/>
+        </w:rPr>
+        <w:t xml:space="preserve"> class not only in the block class (“</w:t>
       </w:r>
       <w:r>
         <w:rPr>
@@ -135,13 +219,31 @@
           <w:bCs/>
           <w:lang w:val="en-GB"/>
         </w:rPr>
-        <w:t>answer in the paper WHY this is important an an improvement over the original spike_gpt.py implementation.</w:t>
-      </w:r>
-    </w:p>
-    <w:p>
-      <w:pPr>
+        <w:t xml:space="preserve">answer in the paper WHY this is important an </w:t>
+      </w:r>
+      <w:proofErr w:type="spellStart"/>
+      <w:r>
         <w:rPr>
           <w:b/>
+          <w:bCs/>
+          <w:lang w:val="en-GB"/>
+        </w:rPr>
+        <w:t>an</w:t>
+      </w:r>
+      <w:proofErr w:type="spellEnd"/>
+      <w:r>
+        <w:rPr>
+          <w:b/>
+          <w:bCs/>
+          <w:lang w:val="en-GB"/>
+        </w:rPr>
+        <w:t xml:space="preserve"> improvement over the original spike_gpt.py implementation.</w:t>
+      </w:r>
+    </w:p>
+    <w:p>
+      <w:pPr>
+        <w:rPr>
+          <w:b/>
           <w:lang w:val="en-GB"/>
         </w:rPr>
       </w:pPr>
@@ -163,7 +265,23 @@
           <w:b/>
           <w:lang w:val="en-GB"/>
         </w:rPr>
-        <w:t xml:space="preserve"> Ye prolly.</w:t>
+        <w:t xml:space="preserve"> Ye </w:t>
+      </w:r>
+      <w:proofErr w:type="spellStart"/>
+      <w:r>
+        <w:rPr>
+          <w:b/>
+          <w:lang w:val="en-GB"/>
+        </w:rPr>
+        <w:t>prolly</w:t>
+      </w:r>
+      <w:proofErr w:type="spellEnd"/>
+      <w:r>
+        <w:rPr>
+          <w:b/>
+          <w:lang w:val="en-GB"/>
+        </w:rPr>
+        <w:t>.</w:t>
       </w:r>
     </w:p>
     <w:p>
@@ -196,7 +314,21 @@
         <w:rPr>
           <w:lang w:val="en-GB"/>
         </w:rPr>
-        <w:t>- Added Coordinate Aware embeddings and todos in excel</w:t>
+        <w:t xml:space="preserve">- Added Coordinate Aware embeddings and </w:t>
+      </w:r>
+      <w:proofErr w:type="spellStart"/>
+      <w:r>
+        <w:rPr>
+          <w:lang w:val="en-GB"/>
+        </w:rPr>
+        <w:t>todos</w:t>
+      </w:r>
+      <w:proofErr w:type="spellEnd"/>
+      <w:r>
+        <w:rPr>
+          <w:lang w:val="en-GB"/>
+        </w:rPr>
+        <w:t xml:space="preserve"> in excel</w:t>
       </w:r>
     </w:p>
     <w:p>
@@ -252,7 +384,15 @@
         </w:numPr>
       </w:pPr>
       <w:r>
-        <w:t>Zero-Shot / Low-Rank Generalization für neue Sessions (Abschnitt 5.3 &amp; 5.4)</w:t>
+        <w:t xml:space="preserve">Zero-Shot / Low-Rank </w:t>
+      </w:r>
+      <w:proofErr w:type="spellStart"/>
+      <w:r>
+        <w:t>Generalization</w:t>
+      </w:r>
+      <w:proofErr w:type="spellEnd"/>
+      <w:r>
+        <w:t xml:space="preserve"> für neue Sessions (Abschnitt 5.3 &amp; 5.4)</w:t>
       </w:r>
       <w:r>
         <w:t xml:space="preserve"> </w:t>
@@ -261,7 +401,39 @@
         <w:br/>
       </w:r>
       <w:r>
-        <w:t>Das TRIBE v2 Paper ist stolz darauf, dass es auf *völlig neue Probanden* generalisieren kann ("Unseen subject prediction" via Subject Dropout und Low-Rank Matrix Factorization).</w:t>
+        <w:t>Das TRIBE v2 Paper ist stolz darauf, dass es auf *völlig neue Probanden* generalisieren kann ("</w:t>
+      </w:r>
+      <w:proofErr w:type="spellStart"/>
+      <w:r>
+        <w:t>Unseen</w:t>
+      </w:r>
+      <w:proofErr w:type="spellEnd"/>
+      <w:r>
+        <w:t xml:space="preserve"> </w:t>
+      </w:r>
+      <w:proofErr w:type="spellStart"/>
+      <w:r>
+        <w:t>subject</w:t>
+      </w:r>
+      <w:proofErr w:type="spellEnd"/>
+      <w:r>
+        <w:t xml:space="preserve"> </w:t>
+      </w:r>
+      <w:proofErr w:type="spellStart"/>
+      <w:r>
+        <w:t>prediction</w:t>
+      </w:r>
+      <w:proofErr w:type="spellEnd"/>
+      <w:r>
+        <w:t xml:space="preserve">" via Subject Dropout und Low-Rank Matrix </w:t>
+      </w:r>
+      <w:proofErr w:type="spellStart"/>
+      <w:r>
+        <w:t>Factorization</w:t>
+      </w:r>
+      <w:proofErr w:type="spellEnd"/>
+      <w:r>
+        <w:t>).</w:t>
       </w:r>
     </w:p>
     <w:p>
@@ -273,7 +445,39 @@
         </w:numPr>
       </w:pPr>
       <w:r>
-        <w:t>**Problem in deinem Code:** Dein `LearnedSessionAdapter` (Zeile 331) lernt für jede Session im Dataset komplett neue Eingangs- und Ausgangsgewichte (`_unit_in`, `_unit_out`). Wenn du eine völlig neue Maus aus dem Allen Brain Dataset testen willst, versagt das Modell, weil es keine Gewichte dafür hat.</w:t>
+        <w:t xml:space="preserve">**Problem in deinem </w:t>
+      </w:r>
+      <w:proofErr w:type="gramStart"/>
+      <w:r>
+        <w:t>Code:*</w:t>
+      </w:r>
+      <w:proofErr w:type="gramEnd"/>
+      <w:r>
+        <w:t>* Dein `</w:t>
+      </w:r>
+      <w:proofErr w:type="spellStart"/>
+      <w:r>
+        <w:t>LearnedSessionAdapter</w:t>
+      </w:r>
+      <w:proofErr w:type="spellEnd"/>
+      <w:r>
+        <w:t>` (Zeile 331) lernt für jede Session im Dataset komplett neue Eingangs- und Ausgangsgewichte (`_</w:t>
+      </w:r>
+      <w:proofErr w:type="spellStart"/>
+      <w:r>
+        <w:t>unit_in</w:t>
+      </w:r>
+      <w:proofErr w:type="spellEnd"/>
+      <w:r>
+        <w:t>`, `_</w:t>
+      </w:r>
+      <w:proofErr w:type="spellStart"/>
+      <w:r>
+        <w:t>unit_out</w:t>
+      </w:r>
+      <w:proofErr w:type="spellEnd"/>
+      <w:r>
+        <w:t>`). Wenn du eine völlig neue Maus aus dem Allen Brain Dataset testen willst, versagt das Modell, weil es keine Gewichte dafür hat.</w:t>
       </w:r>
     </w:p>
     <w:p>
@@ -285,7 +489,31 @@
         </w:numPr>
       </w:pPr>
       <w:r>
-        <w:t>**Deine Verbesserung:** Implementiere genau den Trick aus dem Paper (Abschnitt 5.4)! Trainiere eine Matrix-Faktorisierung (SVD) für den Adapter oder nutze einen "Unseen Session Token" mit *Subject Dropout* (während des Trainings wird ab und zu die Session-spezifische Info maskiert, damit das Modell lernt, universelle Gehirnmuster zu erkennen). Das wäre ein **massives Upgrade** für deinen Code.</w:t>
+        <w:t xml:space="preserve">**Deine </w:t>
+      </w:r>
+      <w:proofErr w:type="gramStart"/>
+      <w:r>
+        <w:t>Verbesserung:*</w:t>
+      </w:r>
+      <w:proofErr w:type="gramEnd"/>
+      <w:r>
+        <w:t xml:space="preserve">* </w:t>
+      </w:r>
+      <w:proofErr w:type="gramStart"/>
+      <w:r>
+        <w:t>Implementiere</w:t>
+      </w:r>
+      <w:proofErr w:type="gramEnd"/>
+      <w:r>
+        <w:t xml:space="preserve"> genau den Trick aus dem Paper (Abschnitt 5.4)! Trainiere eine Matrix-Faktorisierung (SVD) für den Adapter oder nutze einen "</w:t>
+      </w:r>
+      <w:proofErr w:type="spellStart"/>
+      <w:r>
+        <w:t>Unseen</w:t>
+      </w:r>
+      <w:proofErr w:type="spellEnd"/>
+      <w:r>
+        <w:t xml:space="preserve"> Session Token" mit *Subject Dropout* (während des Trainings wird ab und zu die Session-spezifische Info maskiert, damit das Modell lernt, universelle Gehirnmuster zu erkennen). Das wäre ein **massives Upgrade** für deinen Code.</w:t>
       </w:r>
     </w:p>
     <w:p>
@@ -296,8 +524,13 @@
           <w:numId w:val="1"/>
         </w:numPr>
       </w:pPr>
-      <w:r>
-        <w:t>Modality Dropout (Abschnitt 5.3)</w:t>
+      <w:proofErr w:type="spellStart"/>
+      <w:r>
+        <w:t>Modality</w:t>
+      </w:r>
+      <w:proofErr w:type="spellEnd"/>
+      <w:r>
+        <w:t xml:space="preserve"> Dropout (Abschnitt 5.3)</w:t>
       </w:r>
       <w:r>
         <w:br/>
@@ -318,7 +551,31 @@
         <w:t>*</w:t>
       </w:r>
       <w:r>
-        <w:t>*Deine Verbesserung:** Dein Code hat "Masking" von Neuronen (Zeile 244: `_mask_two_bands`). Du könntest das Konzept aus dem Paper adaptieren, indem du systematisch ganze Hirnareale (z.B. den visuellen Kortex V1) maskierst, um zu testen, ob das Modell die Spikes dort aus den Spikes anderer Areale (z.B. LM oder AL) rekonstruieren kann.</w:t>
+        <w:t xml:space="preserve">*Deine </w:t>
+      </w:r>
+      <w:proofErr w:type="gramStart"/>
+      <w:r>
+        <w:t>Verbesserung:*</w:t>
+      </w:r>
+      <w:proofErr w:type="gramEnd"/>
+      <w:r>
+        <w:t>* Dein Code hat "</w:t>
+      </w:r>
+      <w:proofErr w:type="spellStart"/>
+      <w:r>
+        <w:t>Masking</w:t>
+      </w:r>
+      <w:proofErr w:type="spellEnd"/>
+      <w:r>
+        <w:t>" von Neuronen (Zeile 244: `_</w:t>
+      </w:r>
+      <w:proofErr w:type="spellStart"/>
+      <w:r>
+        <w:t>mask_two_bands</w:t>
+      </w:r>
+      <w:proofErr w:type="spellEnd"/>
+      <w:r>
+        <w:t>`). Du könntest das Konzept aus dem Paper adaptieren, indem du systematisch ganze Hirnareale (z.B. den visuellen Kortex V1) maskierst, um zu testen, ob das Modell die Spikes dort aus den Spikes anderer Areale (z.B. LM oder AL) rekonstruieren kann.</w:t>
       </w:r>
     </w:p>
     <w:p/>
@@ -342,7 +599,15 @@
         <w:br/>
       </w:r>
       <w:r>
-        <w:t>Das Paper wendet Independent Component Analysis (ICA) auf die letzte Schicht des Transformers an und zeigt, dass die KI von selbst bekannte Gehirnnetzwerke (wie das Default Mode Network) gelernt hat (Abbildung 6).</w:t>
+        <w:t xml:space="preserve">Das Paper wendet Independent </w:t>
+      </w:r>
+      <w:proofErr w:type="spellStart"/>
+      <w:r>
+        <w:t>Component</w:t>
+      </w:r>
+      <w:proofErr w:type="spellEnd"/>
+      <w:r>
+        <w:t xml:space="preserve"> Analysis (ICA) auf die letzte Schicht des Transformers an und zeigt, dass die KI von selbst bekannte Gehirnnetzwerke (wie das Default Mode Network) gelernt hat (Abbildung 6).</w:t>
       </w:r>
     </w:p>
     <w:p>
@@ -354,7 +619,47 @@
         </w:numPr>
       </w:pPr>
       <w:r>
-        <w:t xml:space="preserve">**Wie du das für deinen Code machst:** Nimm die Hidden States (`h`) deines Transformers. Wende PCA oder ICA aus `scikit-learn` darauf an. Plotte diese Komponenten gegen das Verhalten der Maus (z.B. die `running_speed` oder `pupil_area` aus dem Code). </w:t>
+        <w:t xml:space="preserve">**Wie du das für deinen Code </w:t>
+      </w:r>
+      <w:proofErr w:type="gramStart"/>
+      <w:r>
+        <w:t>machst:*</w:t>
+      </w:r>
+      <w:proofErr w:type="gramEnd"/>
+      <w:r>
+        <w:t xml:space="preserve">* </w:t>
+      </w:r>
+      <w:proofErr w:type="gramStart"/>
+      <w:r>
+        <w:t>Nimm</w:t>
+      </w:r>
+      <w:proofErr w:type="gramEnd"/>
+      <w:r>
+        <w:t xml:space="preserve"> die Hidden States (`h`) deines Transformers. Wende PCA oder ICA aus `</w:t>
+      </w:r>
+      <w:proofErr w:type="spellStart"/>
+      <w:r>
+        <w:t>scikit-learn</w:t>
+      </w:r>
+      <w:proofErr w:type="spellEnd"/>
+      <w:r>
+        <w:t>` darauf an. Plotte diese Komponenten gegen das Verhalten der Maus (z.B. die `</w:t>
+      </w:r>
+      <w:proofErr w:type="spellStart"/>
+      <w:r>
+        <w:t>running_speed</w:t>
+      </w:r>
+      <w:proofErr w:type="spellEnd"/>
+      <w:r>
+        <w:t>` oder `</w:t>
+      </w:r>
+      <w:proofErr w:type="spellStart"/>
+      <w:r>
+        <w:t>pupil_area</w:t>
+      </w:r>
+      <w:proofErr w:type="spellEnd"/>
+      <w:r>
+        <w:t xml:space="preserve">` aus dem Code). </w:t>
       </w:r>
     </w:p>
     <w:p>
@@ -369,7 +674,23 @@
         <w:t>**</w:t>
       </w:r>
       <w:r>
-        <w:t>Die These:** Du zeigst damit, dass der Transformer intern eine abstrakte, interpretierbare Repräsentation des Gehirnzustands bildet, auch wenn er nur auf rohe Nullen und Einsen (Spikes) trainiert wurde.</w:t>
+        <w:t xml:space="preserve">Die </w:t>
+      </w:r>
+      <w:proofErr w:type="gramStart"/>
+      <w:r>
+        <w:t>These:*</w:t>
+      </w:r>
+      <w:proofErr w:type="gramEnd"/>
+      <w:r>
+        <w:t xml:space="preserve">* Du zeigst damit, dass der Transformer intern eine abstrakte, interpretierbare Repräsentation des Gehirnzustands bildet, auch wenn er nur </w:t>
+      </w:r>
+      <w:proofErr w:type="gramStart"/>
+      <w:r>
+        <w:t>auf rohe Nullen</w:t>
+      </w:r>
+      <w:proofErr w:type="gramEnd"/>
+      <w:r>
+        <w:t xml:space="preserve"> und Einsen (Spikes) trainiert wurde.</w:t>
       </w:r>
     </w:p>
     <w:p>
@@ -384,7 +705,35 @@
         <w:rPr>
           <w:lang w:val="en-GB"/>
         </w:rPr>
-        <w:t xml:space="preserve">Transfer-Learning auf neue Tiere ("Generalization to new subjects", Abschn. </w:t>
+        <w:t xml:space="preserve">Transfer-Learning auf </w:t>
+      </w:r>
+      <w:proofErr w:type="spellStart"/>
+      <w:r>
+        <w:rPr>
+          <w:lang w:val="en-GB"/>
+        </w:rPr>
+        <w:t>neue</w:t>
+      </w:r>
+      <w:proofErr w:type="spellEnd"/>
+      <w:r>
+        <w:rPr>
+          <w:lang w:val="en-GB"/>
+        </w:rPr>
+        <w:t xml:space="preserve"> Tiere ("Generalization to new subjects", </w:t>
+      </w:r>
+      <w:proofErr w:type="spellStart"/>
+      <w:r>
+        <w:rPr>
+          <w:lang w:val="en-GB"/>
+        </w:rPr>
+        <w:t>Abschn</w:t>
+      </w:r>
+      <w:proofErr w:type="spellEnd"/>
+      <w:r>
+        <w:rPr>
+          <w:lang w:val="en-GB"/>
+        </w:rPr>
+        <w:t xml:space="preserve">. </w:t>
       </w:r>
       <w:r>
         <w:rPr>
@@ -399,7 +748,15 @@
         <w:br/>
       </w:r>
       <w:r>
-        <w:t>Im Paper wird das Modell auf neuen Probanden getestet, indem es mit extrem wenig Daten (1 Stunde fMRI) nach-trainiert wird (Fine-Tuning).</w:t>
+        <w:t xml:space="preserve">Im Paper wird das Modell auf neuen Probanden getestet, indem es mit </w:t>
+      </w:r>
+      <w:proofErr w:type="gramStart"/>
+      <w:r>
+        <w:t>extrem wenig</w:t>
+      </w:r>
+      <w:proofErr w:type="gramEnd"/>
+      <w:r>
+        <w:t xml:space="preserve"> Daten (1 Stunde fMRI) nach-trainiert wird (Fine-Tuning).</w:t>
       </w:r>
     </w:p>
     <w:p>
@@ -411,7 +768,31 @@
         </w:numPr>
       </w:pPr>
       <w:r>
-        <w:t xml:space="preserve">**Wie du das für deinen Code machst:** Aktuell wertet dein Code die Validierung aus, indem er einfach die letzten 2 Minuten *derselben* Trainings-Sessions nimmt (Zeile 210). Für deine Arbeit könntest du den Transformer auf 15 Mäusen trainieren und einfrieren. Dann nimmst du eine 16. (ungesehene) Maus. Du trainierst *nur* den `LearnedSessionAdapter` (die Input/Output-Gewichte) für wenige Epochen (z.B. auf nur 1 Minute Daten dieser neuen Maus). </w:t>
+        <w:t xml:space="preserve">**Wie du das für deinen Code </w:t>
+      </w:r>
+      <w:proofErr w:type="gramStart"/>
+      <w:r>
+        <w:t>machst:*</w:t>
+      </w:r>
+      <w:proofErr w:type="gramEnd"/>
+      <w:r>
+        <w:t>* Aktuell wertet dein Code die Validierung aus, indem er einfach die letzten 2 Minuten *derselben* Trainings-Sessions nimmt (Zeile 210). Für deine Arbeit könntest du den Transformer auf 15 Mäusen trainieren und einfrieren. Dann nimmst du eine 16. (ungesehene) Maus. Du trainierst *nur* den `</w:t>
+      </w:r>
+      <w:proofErr w:type="spellStart"/>
+      <w:r>
+        <w:t>LearnedSessionAdapter</w:t>
+      </w:r>
+      <w:proofErr w:type="spellEnd"/>
+      <w:r>
+        <w:t>` (</w:t>
+      </w:r>
+      <w:proofErr w:type="gramStart"/>
+      <w:r>
+        <w:t>die Input</w:t>
+      </w:r>
+      <w:proofErr w:type="gramEnd"/>
+      <w:r>
+        <w:t xml:space="preserve">/Output-Gewichte) für wenige Epochen (z.B. auf nur 1 Minute Daten dieser neuen Maus). </w:t>
       </w:r>
     </w:p>
     <w:p>
@@ -426,7 +807,15 @@
         <w:t>**</w:t>
       </w:r>
       <w:r>
-        <w:t>Die These:** Zeige, dass der vortrainierte Transformer es ermöglicht, die Gehirnaktivität einer neuen Maus viel schneller und mit viel weniger Daten zu lernen, als wenn man ein Modell von Grund auf neu trainiert ("Few-Shot Transfer").</w:t>
+        <w:t xml:space="preserve">Die </w:t>
+      </w:r>
+      <w:proofErr w:type="gramStart"/>
+      <w:r>
+        <w:t>These:*</w:t>
+      </w:r>
+      <w:proofErr w:type="gramEnd"/>
+      <w:r>
+        <w:t>* Zeige, dass der vortrainierte Transformer es ermöglicht, die Gehirnaktivität einer neuen Maus viel schneller und mit viel weniger Daten zu lernen, als wenn man ein Modell von Grund auf neu trainiert ("Few-Shot Transfer").</w:t>
       </w:r>
     </w:p>
     <w:p/>
@@ -506,6 +895,7 @@
         </w:rPr>
         <w:t xml:space="preserve">. My goal is to implement a transformer network from scratch, heavily inspired by your existing </w:t>
       </w:r>
+      <w:proofErr w:type="spellStart"/>
       <w:r>
         <w:rPr>
           <w:lang w:val="en-US"/>
@@ -524,6 +914,7 @@
         </w:rPr>
         <w:t>_gpt</w:t>
       </w:r>
+      <w:proofErr w:type="spellEnd"/>
       <w:r>
         <w:rPr>
           <w:lang w:val="en-US"/>
@@ -704,7 +1095,21 @@
         <w:rPr>
           <w:lang w:val="en-US"/>
         </w:rPr>
-        <w:t>Maybe you can quickly respond to improvements (1-3) and evaluations (A,B) and tell me feasibility</w:t>
+        <w:t>Maybe you can quickly respond to improvements (1-3) and evaluations (</w:t>
+      </w:r>
+      <w:proofErr w:type="gramStart"/>
+      <w:r>
+        <w:rPr>
+          <w:lang w:val="en-US"/>
+        </w:rPr>
+        <w:t>A,B</w:t>
+      </w:r>
+      <w:proofErr w:type="gramEnd"/>
+      <w:r>
+        <w:rPr>
+          <w:lang w:val="en-US"/>
+        </w:rPr>
+        <w:t>) and tell me feasibility</w:t>
       </w:r>
       <w:r>
         <w:rPr>
@@ -778,11 +1183,6 @@
       </w:pPr>
     </w:p>
     <w:p>
-      <w:pPr>
-        <w:rPr>
-          <w:lang w:val="en-US"/>
-        </w:rPr>
-      </w:pPr>
       <w:r>
         <w:rPr>
           <w:lang w:val="en-US"/>
@@ -810,6 +1210,129 @@
           <w:t>https://ai.meta.com/blog/tribe-v2-brain-predictive-foundation-model/</w:t>
         </w:r>
       </w:hyperlink>
+    </w:p>
+    <w:p/>
+    <w:p/>
+    <w:p>
+      <w:pPr>
+        <w:rPr>
+          <w:lang w:val="en-US"/>
+        </w:rPr>
+      </w:pPr>
+      <w:r>
+        <w:rPr>
+          <w:lang w:val="en-US"/>
+        </w:rPr>
+        <w:t>02.04.2026</w:t>
+      </w:r>
+    </w:p>
+    <w:p>
+      <w:pPr>
+        <w:pStyle w:val="Listenabsatz"/>
+        <w:numPr>
+          <w:ilvl w:val="0"/>
+          <w:numId w:val="3"/>
+        </w:numPr>
+        <w:rPr>
+          <w:lang w:val="en-US"/>
+        </w:rPr>
+      </w:pPr>
+      <w:r>
+        <w:rPr>
+          <w:lang w:val="en-US"/>
+        </w:rPr>
+        <w:t xml:space="preserve">The </w:t>
+      </w:r>
+      <w:proofErr w:type="spellStart"/>
+      <w:r>
+        <w:rPr>
+          <w:lang w:val="en-US"/>
+        </w:rPr>
+        <w:t>LearnedSessionAdapter</w:t>
+      </w:r>
+      <w:proofErr w:type="spellEnd"/>
+      <w:r>
+        <w:rPr>
+          <w:lang w:val="en-US"/>
+        </w:rPr>
+        <w:t xml:space="preserve"> class is </w:t>
+      </w:r>
+      <w:proofErr w:type="gramStart"/>
+      <w:r>
+        <w:rPr>
+          <w:lang w:val="en-US"/>
+        </w:rPr>
+        <w:t>really helpful</w:t>
+      </w:r>
+      <w:proofErr w:type="gramEnd"/>
+      <w:r>
+        <w:rPr>
+          <w:lang w:val="en-US"/>
+        </w:rPr>
+        <w:t xml:space="preserve"> since you don’t have to retrain the whole transformer </w:t>
+      </w:r>
+      <w:proofErr w:type="spellStart"/>
+      <w:proofErr w:type="gramStart"/>
+      <w:r>
+        <w:rPr>
+          <w:lang w:val="en-US"/>
+        </w:rPr>
+        <w:t>everytime</w:t>
+      </w:r>
+      <w:proofErr w:type="spellEnd"/>
+      <w:proofErr w:type="gramEnd"/>
+      <w:r>
+        <w:rPr>
+          <w:lang w:val="en-US"/>
+        </w:rPr>
+        <w:t xml:space="preserve"> you train it on a new brain with different </w:t>
+      </w:r>
+      <w:proofErr w:type="gramStart"/>
+      <w:r>
+        <w:rPr>
+          <w:lang w:val="en-US"/>
+        </w:rPr>
+        <w:t># of neural</w:t>
+      </w:r>
+      <w:proofErr w:type="gramEnd"/>
+      <w:r>
+        <w:rPr>
+          <w:lang w:val="en-US"/>
+        </w:rPr>
+        <w:t xml:space="preserve"> data.</w:t>
+      </w:r>
+    </w:p>
+    <w:p>
+      <w:pPr>
+        <w:pStyle w:val="Listenabsatz"/>
+        <w:numPr>
+          <w:ilvl w:val="0"/>
+          <w:numId w:val="3"/>
+        </w:numPr>
+        <w:rPr>
+          <w:lang w:val="en-US"/>
+        </w:rPr>
+      </w:pPr>
+      <w:r>
+        <w:rPr>
+          <w:lang w:val="en-US"/>
+        </w:rPr>
+        <w:t xml:space="preserve">I probably need to change way </w:t>
+      </w:r>
+      <w:proofErr w:type="gramStart"/>
+      <w:r>
+        <w:rPr>
+          <w:lang w:val="en-US"/>
+        </w:rPr>
+        <w:t>less  than</w:t>
+      </w:r>
+      <w:proofErr w:type="gramEnd"/>
+      <w:r>
+        <w:rPr>
+          <w:lang w:val="en-US"/>
+        </w:rPr>
+        <w:t xml:space="preserve"> anticipated since most of the code is Task specific anyways.</w:t>
+      </w:r>
     </w:p>
     <w:sectPr>
       <w:pgSz w:w="11906" w:h="16838"/>
@@ -824,6 +1347,119 @@
 <file path=word/numbering.xml><?xml version="1.0" encoding="utf-8"?>
 <w:numbering xmlns:wpc="http://schemas.microsoft.com/office/word/2010/wordprocessingCanvas" xmlns:cx="http://schemas.microsoft.com/office/drawing/2014/chartex" xmlns:cx1="http://schemas.microsoft.com/office/drawing/2015/9/8/chartex" xmlns:cx2="http://schemas.microsoft.com/office/drawing/2015/10/21/chartex" xmlns:cx3="http://schemas.microsoft.com/office/drawing/2016/5/9/chartex" xmlns:cx4="http://schemas.microsoft.com/office/drawing/2016/5/10/chartex" xmlns:cx5="http://schemas.microsoft.com/office/drawing/2016/5/11/chartex" xmlns:cx6="http://schemas.microsoft.com/office/drawing/2016/5/12/chartex" xmlns:cx7="http://schemas.microsoft.com/office/drawing/2016/5/13/chartex" xmlns:cx8="http://schemas.microsoft.com/office/drawing/2016/5/14/chartex" xmlns:mc="http://schemas.openxmlformats.org/markup-compatibility/2006" xmlns:aink="http://schemas.microsoft.com/office/drawing/2016/ink" xmlns:am3d="http://schemas.microsoft.com/office/drawing/2017/model3d" xmlns:o="urn:schemas-microsoft-com:office:office" xmlns:oel="http://schemas.microsoft.com/office/2019/extlst" xmlns:r="http://schemas.openxmlformats.org/officeDocument/2006/relationships" xmlns:m="http://schemas.openxmlformats.org/officeDocument/2006/math" xmlns:v="urn:schemas-microsoft-com:vml" xmlns:wp14="http://schemas.microsoft.com/office/word/2010/wordprocessingDrawing" xmlns:wp="http://schemas.openxmlformats.org/drawingml/2006/wordprocessingDrawing" xmlns:w10="urn:schemas-microsoft-com:office:word" xmlns:w="http://schemas.openxmlformats.org/wordprocessingml/2006/main" xmlns:w14="http://schemas.microsoft.com/office/word/2010/wordml" xmlns:w15="http://schemas.microsoft.com/office/word/2012/wordml" xmlns:w16cex="http://schemas.microsoft.com/office/word/2018/wordml/cex" xmlns:w16cid="http://schemas.microsoft.com/office/word/2016/wordml/cid" xmlns:w16="http://schemas.microsoft.com/office/word/2018/wordml" xmlns:w16du="http://schemas.microsoft.com/office/word/2023/wordml/word16du" xmlns:w16sdtdh="http://schemas.microsoft.com/office/word/2020/wordml/sdtdatahash" xmlns:w16sdtfl="http://schemas.microsoft.com/office/word/2024/wordml/sdtformatlock" xmlns:w16se="http://schemas.microsoft.com/office/word/2015/wordml/symex" xmlns:wpg="http://schemas.microsoft.com/office/word/2010/wordprocessingGroup" xmlns:wpi="http://schemas.microsoft.com/office/word/2010/wordprocessingInk" xmlns:wne="http://schemas.microsoft.com/office/word/2006/wordml" xmlns:wps="http://schemas.microsoft.com/office/word/2010/wordprocessingShape" mc:Ignorable="w14 w15 w16se w16cid w16 w16cex w16sdtdh w16sdtfl w16du wp14">
   <w:abstractNum w:abstractNumId="0" w15:restartNumberingAfterBreak="0">
+    <w:nsid w:val="12CD6D14"/>
+    <w:multiLevelType w:val="hybridMultilevel"/>
+    <w:tmpl w:val="F1B8E19C"/>
+    <w:lvl w:ilvl="0" w:tplc="04070001">
+      <w:start w:val="1"/>
+      <w:numFmt w:val="bullet"/>
+      <w:lvlText w:val=""/>
+      <w:lvlJc w:val="left"/>
+      <w:pPr>
+        <w:ind w:left="720" w:hanging="360"/>
+      </w:pPr>
+      <w:rPr>
+        <w:rFonts w:ascii="Symbol" w:hAnsi="Symbol" w:hint="default"/>
+      </w:rPr>
+    </w:lvl>
+    <w:lvl w:ilvl="1" w:tplc="04070003" w:tentative="1">
+      <w:start w:val="1"/>
+      <w:numFmt w:val="bullet"/>
+      <w:lvlText w:val="o"/>
+      <w:lvlJc w:val="left"/>
+      <w:pPr>
+        <w:ind w:left="1440" w:hanging="360"/>
+      </w:pPr>
+      <w:rPr>
+        <w:rFonts w:ascii="Courier New" w:hAnsi="Courier New" w:cs="Courier New" w:hint="default"/>
+      </w:rPr>
+    </w:lvl>
+    <w:lvl w:ilvl="2" w:tplc="04070005" w:tentative="1">
+      <w:start w:val="1"/>
+      <w:numFmt w:val="bullet"/>
+      <w:lvlText w:val=""/>
+      <w:lvlJc w:val="left"/>
+      <w:pPr>
+        <w:ind w:left="2160" w:hanging="360"/>
+      </w:pPr>
+      <w:rPr>
+        <w:rFonts w:ascii="Wingdings" w:hAnsi="Wingdings" w:hint="default"/>
+      </w:rPr>
+    </w:lvl>
+    <w:lvl w:ilvl="3" w:tplc="04070001" w:tentative="1">
+      <w:start w:val="1"/>
+      <w:numFmt w:val="bullet"/>
+      <w:lvlText w:val=""/>
+      <w:lvlJc w:val="left"/>
+      <w:pPr>
+        <w:ind w:left="2880" w:hanging="360"/>
+      </w:pPr>
+      <w:rPr>
+        <w:rFonts w:ascii="Symbol" w:hAnsi="Symbol" w:hint="default"/>
+      </w:rPr>
+    </w:lvl>
+    <w:lvl w:ilvl="4" w:tplc="04070003" w:tentative="1">
+      <w:start w:val="1"/>
+      <w:numFmt w:val="bullet"/>
+      <w:lvlText w:val="o"/>
+      <w:lvlJc w:val="left"/>
+      <w:pPr>
+        <w:ind w:left="3600" w:hanging="360"/>
+      </w:pPr>
+      <w:rPr>
+        <w:rFonts w:ascii="Courier New" w:hAnsi="Courier New" w:cs="Courier New" w:hint="default"/>
+      </w:rPr>
+    </w:lvl>
+    <w:lvl w:ilvl="5" w:tplc="04070005" w:tentative="1">
+      <w:start w:val="1"/>
+      <w:numFmt w:val="bullet"/>
+      <w:lvlText w:val=""/>
+      <w:lvlJc w:val="left"/>
+      <w:pPr>
+        <w:ind w:left="4320" w:hanging="360"/>
+      </w:pPr>
+      <w:rPr>
+        <w:rFonts w:ascii="Wingdings" w:hAnsi="Wingdings" w:hint="default"/>
+      </w:rPr>
+    </w:lvl>
+    <w:lvl w:ilvl="6" w:tplc="04070001" w:tentative="1">
+      <w:start w:val="1"/>
+      <w:numFmt w:val="bullet"/>
+      <w:lvlText w:val=""/>
+      <w:lvlJc w:val="left"/>
+      <w:pPr>
+        <w:ind w:left="5040" w:hanging="360"/>
+      </w:pPr>
+      <w:rPr>
+        <w:rFonts w:ascii="Symbol" w:hAnsi="Symbol" w:hint="default"/>
+      </w:rPr>
+    </w:lvl>
+    <w:lvl w:ilvl="7" w:tplc="04070003" w:tentative="1">
+      <w:start w:val="1"/>
+      <w:numFmt w:val="bullet"/>
+      <w:lvlText w:val="o"/>
+      <w:lvlJc w:val="left"/>
+      <w:pPr>
+        <w:ind w:left="5760" w:hanging="360"/>
+      </w:pPr>
+      <w:rPr>
+        <w:rFonts w:ascii="Courier New" w:hAnsi="Courier New" w:cs="Courier New" w:hint="default"/>
+      </w:rPr>
+    </w:lvl>
+    <w:lvl w:ilvl="8" w:tplc="04070005" w:tentative="1">
+      <w:start w:val="1"/>
+      <w:numFmt w:val="bullet"/>
+      <w:lvlText w:val=""/>
+      <w:lvlJc w:val="left"/>
+      <w:pPr>
+        <w:ind w:left="6480" w:hanging="360"/>
+      </w:pPr>
+      <w:rPr>
+        <w:rFonts w:ascii="Wingdings" w:hAnsi="Wingdings" w:hint="default"/>
+      </w:rPr>
+    </w:lvl>
+  </w:abstractNum>
+  <w:abstractNum w:abstractNumId="1" w15:restartNumberingAfterBreak="0">
     <w:nsid w:val="5BD71293"/>
     <w:multiLevelType w:val="hybridMultilevel"/>
     <w:tmpl w:val="849E392E"/>
@@ -912,7 +1548,7 @@
       </w:pPr>
     </w:lvl>
   </w:abstractNum>
-  <w:abstractNum w:abstractNumId="1" w15:restartNumberingAfterBreak="0">
+  <w:abstractNum w:abstractNumId="2" w15:restartNumberingAfterBreak="0">
     <w:nsid w:val="77C75845"/>
     <w:multiLevelType w:val="hybridMultilevel"/>
     <w:tmpl w:val="0D96A816"/>
@@ -1002,9 +1638,12 @@
     </w:lvl>
   </w:abstractNum>
   <w:num w:numId="1" w16cid:durableId="965114167">
+    <w:abstractNumId w:val="2"/>
+  </w:num>
+  <w:num w:numId="2" w16cid:durableId="765271773">
     <w:abstractNumId w:val="1"/>
   </w:num>
-  <w:num w:numId="2" w16cid:durableId="765271773">
+  <w:num w:numId="3" w16cid:durableId="1696231785">
     <w:abstractNumId w:val="0"/>
   </w:num>
 </w:numbering>

</xml_diff>

<commit_message>
first default gpt jupyter notebook done
</commit_message>
<xml_diff>
--- a/documents/research log.docx
+++ b/documents/research log.docx
@@ -57,63 +57,7 @@
         <w:rPr>
           <w:lang w:val="en-GB"/>
         </w:rPr>
-        <w:t xml:space="preserve"> I think that the coordinate aware embeddings will be the best </w:t>
-      </w:r>
-      <w:proofErr w:type="gramStart"/>
-      <w:r>
-        <w:rPr>
-          <w:lang w:val="en-GB"/>
-        </w:rPr>
-        <w:t>improvement</w:t>
-      </w:r>
-      <w:proofErr w:type="gramEnd"/>
-      <w:r>
-        <w:rPr>
-          <w:lang w:val="en-GB"/>
-        </w:rPr>
-        <w:t xml:space="preserve"> but I will check </w:t>
-      </w:r>
-      <w:proofErr w:type="spellStart"/>
-      <w:r>
-        <w:rPr>
-          <w:lang w:val="en-GB"/>
-        </w:rPr>
-        <w:t>wether</w:t>
-      </w:r>
-      <w:proofErr w:type="spellEnd"/>
-      <w:r>
-        <w:rPr>
-          <w:lang w:val="en-GB"/>
-        </w:rPr>
-        <w:t xml:space="preserve"> the improvement then came only from this or for example dropout made it </w:t>
-      </w:r>
-      <w:proofErr w:type="gramStart"/>
-      <w:r>
-        <w:rPr>
-          <w:lang w:val="en-GB"/>
-        </w:rPr>
-        <w:t>worse</w:t>
-      </w:r>
-      <w:proofErr w:type="gramEnd"/>
-      <w:r>
-        <w:rPr>
-          <w:lang w:val="en-GB"/>
-        </w:rPr>
-        <w:t xml:space="preserve"> but </w:t>
-      </w:r>
-      <w:proofErr w:type="spellStart"/>
-      <w:r>
-        <w:rPr>
-          <w:lang w:val="en-GB"/>
-        </w:rPr>
-        <w:t>dropout+coordinate</w:t>
-      </w:r>
-      <w:proofErr w:type="spellEnd"/>
-      <w:r>
-        <w:rPr>
-          <w:lang w:val="en-GB"/>
-        </w:rPr>
-        <w:t xml:space="preserve"> aware embeddings still yield an improvement.</w:t>
+        <w:t xml:space="preserve"> I think that the coordinate aware embeddings will be the best improvement but I will check wether the improvement then came only from this or for example dropout made it worse but dropout+coordinate aware embeddings still yield an improvement.</w:t>
       </w:r>
     </w:p>
     <w:p>
@@ -171,35 +115,7 @@
         <w:rPr>
           <w:lang w:val="en-GB"/>
         </w:rPr>
-        <w:t xml:space="preserve">) it says that we should do this, and also in the original </w:t>
-      </w:r>
-      <w:proofErr w:type="spellStart"/>
-      <w:r>
-        <w:rPr>
-          <w:lang w:val="en-GB"/>
-        </w:rPr>
-        <w:t>gpt</w:t>
-      </w:r>
-      <w:proofErr w:type="spellEnd"/>
-      <w:r>
-        <w:rPr>
-          <w:lang w:val="en-GB"/>
-        </w:rPr>
-        <w:t xml:space="preserve"> implementation it said that we should add it in the </w:t>
-      </w:r>
-      <w:proofErr w:type="spellStart"/>
-      <w:r>
-        <w:rPr>
-          <w:lang w:val="en-GB"/>
-        </w:rPr>
-        <w:t>mlp</w:t>
-      </w:r>
-      <w:proofErr w:type="spellEnd"/>
-      <w:r>
-        <w:rPr>
-          <w:lang w:val="en-GB"/>
-        </w:rPr>
-        <w:t xml:space="preserve"> class not only in the block class (“</w:t>
+        <w:t>) it says that we should do this, and also in the original gpt implementation it said that we should add it in the mlp class not only in the block class (“</w:t>
       </w:r>
       <w:r>
         <w:rPr>
@@ -219,69 +135,35 @@
           <w:bCs/>
           <w:lang w:val="en-GB"/>
         </w:rPr>
-        <w:t xml:space="preserve">answer in the paper WHY this is important an </w:t>
-      </w:r>
-      <w:proofErr w:type="spellStart"/>
-      <w:r>
+        <w:t>answer in the paper WHY this is important an an improvement over the original spike_gpt.py implementation.</w:t>
+      </w:r>
+    </w:p>
+    <w:p>
+      <w:pPr>
         <w:rPr>
           <w:b/>
-          <w:bCs/>
-          <w:lang w:val="en-GB"/>
-        </w:rPr>
-        <w:t>an</w:t>
-      </w:r>
-      <w:proofErr w:type="spellEnd"/>
+          <w:lang w:val="en-GB"/>
+        </w:rPr>
+      </w:pPr>
+      <w:r>
+        <w:rPr>
+          <w:lang w:val="en-GB"/>
+        </w:rPr>
+        <w:t xml:space="preserve">- </w:t>
+      </w:r>
       <w:r>
         <w:rPr>
           <w:b/>
-          <w:bCs/>
-          <w:lang w:val="en-GB"/>
-        </w:rPr>
-        <w:t xml:space="preserve"> improvement over the original spike_gpt.py implementation.</w:t>
-      </w:r>
-    </w:p>
-    <w:p>
-      <w:pPr>
+          <w:lang w:val="en-GB"/>
+        </w:rPr>
+        <w:t>the question is: should I test the improvements independently?</w:t>
+      </w:r>
+      <w:r>
         <w:rPr>
           <w:b/>
           <w:lang w:val="en-GB"/>
         </w:rPr>
-      </w:pPr>
-      <w:r>
-        <w:rPr>
-          <w:lang w:val="en-GB"/>
-        </w:rPr>
-        <w:t xml:space="preserve">- </w:t>
-      </w:r>
-      <w:r>
-        <w:rPr>
-          <w:b/>
-          <w:lang w:val="en-GB"/>
-        </w:rPr>
-        <w:t>the question is: should I test the improvements independently?</w:t>
-      </w:r>
-      <w:r>
-        <w:rPr>
-          <w:b/>
-          <w:lang w:val="en-GB"/>
-        </w:rPr>
-        <w:t xml:space="preserve"> Ye </w:t>
-      </w:r>
-      <w:proofErr w:type="spellStart"/>
-      <w:r>
-        <w:rPr>
-          <w:b/>
-          <w:lang w:val="en-GB"/>
-        </w:rPr>
-        <w:t>prolly</w:t>
-      </w:r>
-      <w:proofErr w:type="spellEnd"/>
-      <w:r>
-        <w:rPr>
-          <w:b/>
-          <w:lang w:val="en-GB"/>
-        </w:rPr>
-        <w:t>.</w:t>
+        <w:t xml:space="preserve"> Ye prolly.</w:t>
       </w:r>
     </w:p>
     <w:p>
@@ -314,21 +196,7 @@
         <w:rPr>
           <w:lang w:val="en-GB"/>
         </w:rPr>
-        <w:t xml:space="preserve">- Added Coordinate Aware embeddings and </w:t>
-      </w:r>
-      <w:proofErr w:type="spellStart"/>
-      <w:r>
-        <w:rPr>
-          <w:lang w:val="en-GB"/>
-        </w:rPr>
-        <w:t>todos</w:t>
-      </w:r>
-      <w:proofErr w:type="spellEnd"/>
-      <w:r>
-        <w:rPr>
-          <w:lang w:val="en-GB"/>
-        </w:rPr>
-        <w:t xml:space="preserve"> in excel</w:t>
+        <w:t>- Added Coordinate Aware embeddings and todos in excel</w:t>
       </w:r>
     </w:p>
     <w:p>
@@ -384,15 +252,7 @@
         </w:numPr>
       </w:pPr>
       <w:r>
-        <w:t xml:space="preserve">Zero-Shot / Low-Rank </w:t>
-      </w:r>
-      <w:proofErr w:type="spellStart"/>
-      <w:r>
-        <w:t>Generalization</w:t>
-      </w:r>
-      <w:proofErr w:type="spellEnd"/>
-      <w:r>
-        <w:t xml:space="preserve"> für neue Sessions (Abschnitt 5.3 &amp; 5.4)</w:t>
+        <w:t>Zero-Shot / Low-Rank Generalization für neue Sessions (Abschnitt 5.3 &amp; 5.4)</w:t>
       </w:r>
       <w:r>
         <w:t xml:space="preserve"> </w:t>
@@ -401,39 +261,7 @@
         <w:br/>
       </w:r>
       <w:r>
-        <w:t>Das TRIBE v2 Paper ist stolz darauf, dass es auf *völlig neue Probanden* generalisieren kann ("</w:t>
-      </w:r>
-      <w:proofErr w:type="spellStart"/>
-      <w:r>
-        <w:t>Unseen</w:t>
-      </w:r>
-      <w:proofErr w:type="spellEnd"/>
-      <w:r>
-        <w:t xml:space="preserve"> </w:t>
-      </w:r>
-      <w:proofErr w:type="spellStart"/>
-      <w:r>
-        <w:t>subject</w:t>
-      </w:r>
-      <w:proofErr w:type="spellEnd"/>
-      <w:r>
-        <w:t xml:space="preserve"> </w:t>
-      </w:r>
-      <w:proofErr w:type="spellStart"/>
-      <w:r>
-        <w:t>prediction</w:t>
-      </w:r>
-      <w:proofErr w:type="spellEnd"/>
-      <w:r>
-        <w:t xml:space="preserve">" via Subject Dropout und Low-Rank Matrix </w:t>
-      </w:r>
-      <w:proofErr w:type="spellStart"/>
-      <w:r>
-        <w:t>Factorization</w:t>
-      </w:r>
-      <w:proofErr w:type="spellEnd"/>
-      <w:r>
-        <w:t>).</w:t>
+        <w:t>Das TRIBE v2 Paper ist stolz darauf, dass es auf *völlig neue Probanden* generalisieren kann ("Unseen subject prediction" via Subject Dropout und Low-Rank Matrix Factorization).</w:t>
       </w:r>
     </w:p>
     <w:p>
@@ -445,39 +273,7 @@
         </w:numPr>
       </w:pPr>
       <w:r>
-        <w:t xml:space="preserve">**Problem in deinem </w:t>
-      </w:r>
-      <w:proofErr w:type="gramStart"/>
-      <w:r>
-        <w:t>Code:*</w:t>
-      </w:r>
-      <w:proofErr w:type="gramEnd"/>
-      <w:r>
-        <w:t>* Dein `</w:t>
-      </w:r>
-      <w:proofErr w:type="spellStart"/>
-      <w:r>
-        <w:t>LearnedSessionAdapter</w:t>
-      </w:r>
-      <w:proofErr w:type="spellEnd"/>
-      <w:r>
-        <w:t>` (Zeile 331) lernt für jede Session im Dataset komplett neue Eingangs- und Ausgangsgewichte (`_</w:t>
-      </w:r>
-      <w:proofErr w:type="spellStart"/>
-      <w:r>
-        <w:t>unit_in</w:t>
-      </w:r>
-      <w:proofErr w:type="spellEnd"/>
-      <w:r>
-        <w:t>`, `_</w:t>
-      </w:r>
-      <w:proofErr w:type="spellStart"/>
-      <w:r>
-        <w:t>unit_out</w:t>
-      </w:r>
-      <w:proofErr w:type="spellEnd"/>
-      <w:r>
-        <w:t>`). Wenn du eine völlig neue Maus aus dem Allen Brain Dataset testen willst, versagt das Modell, weil es keine Gewichte dafür hat.</w:t>
+        <w:t>**Problem in deinem Code:** Dein `LearnedSessionAdapter` (Zeile 331) lernt für jede Session im Dataset komplett neue Eingangs- und Ausgangsgewichte (`_unit_in`, `_unit_out`). Wenn du eine völlig neue Maus aus dem Allen Brain Dataset testen willst, versagt das Modell, weil es keine Gewichte dafür hat.</w:t>
       </w:r>
     </w:p>
     <w:p>
@@ -489,31 +285,7 @@
         </w:numPr>
       </w:pPr>
       <w:r>
-        <w:t xml:space="preserve">**Deine </w:t>
-      </w:r>
-      <w:proofErr w:type="gramStart"/>
-      <w:r>
-        <w:t>Verbesserung:*</w:t>
-      </w:r>
-      <w:proofErr w:type="gramEnd"/>
-      <w:r>
-        <w:t xml:space="preserve">* </w:t>
-      </w:r>
-      <w:proofErr w:type="gramStart"/>
-      <w:r>
-        <w:t>Implementiere</w:t>
-      </w:r>
-      <w:proofErr w:type="gramEnd"/>
-      <w:r>
-        <w:t xml:space="preserve"> genau den Trick aus dem Paper (Abschnitt 5.4)! Trainiere eine Matrix-Faktorisierung (SVD) für den Adapter oder nutze einen "</w:t>
-      </w:r>
-      <w:proofErr w:type="spellStart"/>
-      <w:r>
-        <w:t>Unseen</w:t>
-      </w:r>
-      <w:proofErr w:type="spellEnd"/>
-      <w:r>
-        <w:t xml:space="preserve"> Session Token" mit *Subject Dropout* (während des Trainings wird ab und zu die Session-spezifische Info maskiert, damit das Modell lernt, universelle Gehirnmuster zu erkennen). Das wäre ein **massives Upgrade** für deinen Code.</w:t>
+        <w:t>**Deine Verbesserung:** Implementiere genau den Trick aus dem Paper (Abschnitt 5.4)! Trainiere eine Matrix-Faktorisierung (SVD) für den Adapter oder nutze einen "Unseen Session Token" mit *Subject Dropout* (während des Trainings wird ab und zu die Session-spezifische Info maskiert, damit das Modell lernt, universelle Gehirnmuster zu erkennen). Das wäre ein **massives Upgrade** für deinen Code.</w:t>
       </w:r>
     </w:p>
     <w:p>
@@ -524,13 +296,8 @@
           <w:numId w:val="1"/>
         </w:numPr>
       </w:pPr>
-      <w:proofErr w:type="spellStart"/>
-      <w:r>
-        <w:t>Modality</w:t>
-      </w:r>
-      <w:proofErr w:type="spellEnd"/>
-      <w:r>
-        <w:t xml:space="preserve"> Dropout (Abschnitt 5.3)</w:t>
+      <w:r>
+        <w:t>Modality Dropout (Abschnitt 5.3)</w:t>
       </w:r>
       <w:r>
         <w:br/>
@@ -551,31 +318,7 @@
         <w:t>*</w:t>
       </w:r>
       <w:r>
-        <w:t xml:space="preserve">*Deine </w:t>
-      </w:r>
-      <w:proofErr w:type="gramStart"/>
-      <w:r>
-        <w:t>Verbesserung:*</w:t>
-      </w:r>
-      <w:proofErr w:type="gramEnd"/>
-      <w:r>
-        <w:t>* Dein Code hat "</w:t>
-      </w:r>
-      <w:proofErr w:type="spellStart"/>
-      <w:r>
-        <w:t>Masking</w:t>
-      </w:r>
-      <w:proofErr w:type="spellEnd"/>
-      <w:r>
-        <w:t>" von Neuronen (Zeile 244: `_</w:t>
-      </w:r>
-      <w:proofErr w:type="spellStart"/>
-      <w:r>
-        <w:t>mask_two_bands</w:t>
-      </w:r>
-      <w:proofErr w:type="spellEnd"/>
-      <w:r>
-        <w:t>`). Du könntest das Konzept aus dem Paper adaptieren, indem du systematisch ganze Hirnareale (z.B. den visuellen Kortex V1) maskierst, um zu testen, ob das Modell die Spikes dort aus den Spikes anderer Areale (z.B. LM oder AL) rekonstruieren kann.</w:t>
+        <w:t>*Deine Verbesserung:** Dein Code hat "Masking" von Neuronen (Zeile 244: `_mask_two_bands`). Du könntest das Konzept aus dem Paper adaptieren, indem du systematisch ganze Hirnareale (z.B. den visuellen Kortex V1) maskierst, um zu testen, ob das Modell die Spikes dort aus den Spikes anderer Areale (z.B. LM oder AL) rekonstruieren kann.</w:t>
       </w:r>
     </w:p>
     <w:p/>
@@ -599,15 +342,7 @@
         <w:br/>
       </w:r>
       <w:r>
-        <w:t xml:space="preserve">Das Paper wendet Independent </w:t>
-      </w:r>
-      <w:proofErr w:type="spellStart"/>
-      <w:r>
-        <w:t>Component</w:t>
-      </w:r>
-      <w:proofErr w:type="spellEnd"/>
-      <w:r>
-        <w:t xml:space="preserve"> Analysis (ICA) auf die letzte Schicht des Transformers an und zeigt, dass die KI von selbst bekannte Gehirnnetzwerke (wie das Default Mode Network) gelernt hat (Abbildung 6).</w:t>
+        <w:t>Das Paper wendet Independent Component Analysis (ICA) auf die letzte Schicht des Transformers an und zeigt, dass die KI von selbst bekannte Gehirnnetzwerke (wie das Default Mode Network) gelernt hat (Abbildung 6).</w:t>
       </w:r>
     </w:p>
     <w:p>
@@ -619,47 +354,7 @@
         </w:numPr>
       </w:pPr>
       <w:r>
-        <w:t xml:space="preserve">**Wie du das für deinen Code </w:t>
-      </w:r>
-      <w:proofErr w:type="gramStart"/>
-      <w:r>
-        <w:t>machst:*</w:t>
-      </w:r>
-      <w:proofErr w:type="gramEnd"/>
-      <w:r>
-        <w:t xml:space="preserve">* </w:t>
-      </w:r>
-      <w:proofErr w:type="gramStart"/>
-      <w:r>
-        <w:t>Nimm</w:t>
-      </w:r>
-      <w:proofErr w:type="gramEnd"/>
-      <w:r>
-        <w:t xml:space="preserve"> die Hidden States (`h`) deines Transformers. Wende PCA oder ICA aus `</w:t>
-      </w:r>
-      <w:proofErr w:type="spellStart"/>
-      <w:r>
-        <w:t>scikit-learn</w:t>
-      </w:r>
-      <w:proofErr w:type="spellEnd"/>
-      <w:r>
-        <w:t>` darauf an. Plotte diese Komponenten gegen das Verhalten der Maus (z.B. die `</w:t>
-      </w:r>
-      <w:proofErr w:type="spellStart"/>
-      <w:r>
-        <w:t>running_speed</w:t>
-      </w:r>
-      <w:proofErr w:type="spellEnd"/>
-      <w:r>
-        <w:t>` oder `</w:t>
-      </w:r>
-      <w:proofErr w:type="spellStart"/>
-      <w:r>
-        <w:t>pupil_area</w:t>
-      </w:r>
-      <w:proofErr w:type="spellEnd"/>
-      <w:r>
-        <w:t xml:space="preserve">` aus dem Code). </w:t>
+        <w:t xml:space="preserve">**Wie du das für deinen Code machst:** Nimm die Hidden States (`h`) deines Transformers. Wende PCA oder ICA aus `scikit-learn` darauf an. Plotte diese Komponenten gegen das Verhalten der Maus (z.B. die `running_speed` oder `pupil_area` aus dem Code). </w:t>
       </w:r>
     </w:p>
     <w:p>
@@ -674,23 +369,7 @@
         <w:t>**</w:t>
       </w:r>
       <w:r>
-        <w:t xml:space="preserve">Die </w:t>
-      </w:r>
-      <w:proofErr w:type="gramStart"/>
-      <w:r>
-        <w:t>These:*</w:t>
-      </w:r>
-      <w:proofErr w:type="gramEnd"/>
-      <w:r>
-        <w:t xml:space="preserve">* Du zeigst damit, dass der Transformer intern eine abstrakte, interpretierbare Repräsentation des Gehirnzustands bildet, auch wenn er nur </w:t>
-      </w:r>
-      <w:proofErr w:type="gramStart"/>
-      <w:r>
-        <w:t>auf rohe Nullen</w:t>
-      </w:r>
-      <w:proofErr w:type="gramEnd"/>
-      <w:r>
-        <w:t xml:space="preserve"> und Einsen (Spikes) trainiert wurde.</w:t>
+        <w:t>Die These:** Du zeigst damit, dass der Transformer intern eine abstrakte, interpretierbare Repräsentation des Gehirnzustands bildet, auch wenn er nur auf rohe Nullen und Einsen (Spikes) trainiert wurde.</w:t>
       </w:r>
     </w:p>
     <w:p>
@@ -705,35 +384,7 @@
         <w:rPr>
           <w:lang w:val="en-GB"/>
         </w:rPr>
-        <w:t xml:space="preserve">Transfer-Learning auf </w:t>
-      </w:r>
-      <w:proofErr w:type="spellStart"/>
-      <w:r>
-        <w:rPr>
-          <w:lang w:val="en-GB"/>
-        </w:rPr>
-        <w:t>neue</w:t>
-      </w:r>
-      <w:proofErr w:type="spellEnd"/>
-      <w:r>
-        <w:rPr>
-          <w:lang w:val="en-GB"/>
-        </w:rPr>
-        <w:t xml:space="preserve"> Tiere ("Generalization to new subjects", </w:t>
-      </w:r>
-      <w:proofErr w:type="spellStart"/>
-      <w:r>
-        <w:rPr>
-          <w:lang w:val="en-GB"/>
-        </w:rPr>
-        <w:t>Abschn</w:t>
-      </w:r>
-      <w:proofErr w:type="spellEnd"/>
-      <w:r>
-        <w:rPr>
-          <w:lang w:val="en-GB"/>
-        </w:rPr>
-        <w:t xml:space="preserve">. </w:t>
+        <w:t xml:space="preserve">Transfer-Learning auf neue Tiere ("Generalization to new subjects", Abschn. </w:t>
       </w:r>
       <w:r>
         <w:rPr>
@@ -748,15 +399,7 @@
         <w:br/>
       </w:r>
       <w:r>
-        <w:t xml:space="preserve">Im Paper wird das Modell auf neuen Probanden getestet, indem es mit </w:t>
-      </w:r>
-      <w:proofErr w:type="gramStart"/>
-      <w:r>
-        <w:t>extrem wenig</w:t>
-      </w:r>
-      <w:proofErr w:type="gramEnd"/>
-      <w:r>
-        <w:t xml:space="preserve"> Daten (1 Stunde fMRI) nach-trainiert wird (Fine-Tuning).</w:t>
+        <w:t>Im Paper wird das Modell auf neuen Probanden getestet, indem es mit extrem wenig Daten (1 Stunde fMRI) nach-trainiert wird (Fine-Tuning).</w:t>
       </w:r>
     </w:p>
     <w:p>
@@ -768,31 +411,7 @@
         </w:numPr>
       </w:pPr>
       <w:r>
-        <w:t xml:space="preserve">**Wie du das für deinen Code </w:t>
-      </w:r>
-      <w:proofErr w:type="gramStart"/>
-      <w:r>
-        <w:t>machst:*</w:t>
-      </w:r>
-      <w:proofErr w:type="gramEnd"/>
-      <w:r>
-        <w:t>* Aktuell wertet dein Code die Validierung aus, indem er einfach die letzten 2 Minuten *derselben* Trainings-Sessions nimmt (Zeile 210). Für deine Arbeit könntest du den Transformer auf 15 Mäusen trainieren und einfrieren. Dann nimmst du eine 16. (ungesehene) Maus. Du trainierst *nur* den `</w:t>
-      </w:r>
-      <w:proofErr w:type="spellStart"/>
-      <w:r>
-        <w:t>LearnedSessionAdapter</w:t>
-      </w:r>
-      <w:proofErr w:type="spellEnd"/>
-      <w:r>
-        <w:t>` (</w:t>
-      </w:r>
-      <w:proofErr w:type="gramStart"/>
-      <w:r>
-        <w:t>die Input</w:t>
-      </w:r>
-      <w:proofErr w:type="gramEnd"/>
-      <w:r>
-        <w:t xml:space="preserve">/Output-Gewichte) für wenige Epochen (z.B. auf nur 1 Minute Daten dieser neuen Maus). </w:t>
+        <w:t xml:space="preserve">**Wie du das für deinen Code machst:** Aktuell wertet dein Code die Validierung aus, indem er einfach die letzten 2 Minuten *derselben* Trainings-Sessions nimmt (Zeile 210). Für deine Arbeit könntest du den Transformer auf 15 Mäusen trainieren und einfrieren. Dann nimmst du eine 16. (ungesehene) Maus. Du trainierst *nur* den `LearnedSessionAdapter` (die Input/Output-Gewichte) für wenige Epochen (z.B. auf nur 1 Minute Daten dieser neuen Maus). </w:t>
       </w:r>
     </w:p>
     <w:p>
@@ -807,15 +426,7 @@
         <w:t>**</w:t>
       </w:r>
       <w:r>
-        <w:t xml:space="preserve">Die </w:t>
-      </w:r>
-      <w:proofErr w:type="gramStart"/>
-      <w:r>
-        <w:t>These:*</w:t>
-      </w:r>
-      <w:proofErr w:type="gramEnd"/>
-      <w:r>
-        <w:t>* Zeige, dass der vortrainierte Transformer es ermöglicht, die Gehirnaktivität einer neuen Maus viel schneller und mit viel weniger Daten zu lernen, als wenn man ein Modell von Grund auf neu trainiert ("Few-Shot Transfer").</w:t>
+        <w:t>Die These:** Zeige, dass der vortrainierte Transformer es ermöglicht, die Gehirnaktivität einer neuen Maus viel schneller und mit viel weniger Daten zu lernen, als wenn man ein Modell von Grund auf neu trainiert ("Few-Shot Transfer").</w:t>
       </w:r>
     </w:p>
     <w:p/>
@@ -895,7 +506,6 @@
         </w:rPr>
         <w:t xml:space="preserve">. My goal is to implement a transformer network from scratch, heavily inspired by your existing </w:t>
       </w:r>
-      <w:proofErr w:type="spellStart"/>
       <w:r>
         <w:rPr>
           <w:lang w:val="en-US"/>
@@ -914,7 +524,6 @@
         </w:rPr>
         <w:t>_gpt</w:t>
       </w:r>
-      <w:proofErr w:type="spellEnd"/>
       <w:r>
         <w:rPr>
           <w:lang w:val="en-US"/>
@@ -1095,21 +704,7 @@
         <w:rPr>
           <w:lang w:val="en-US"/>
         </w:rPr>
-        <w:t>Maybe you can quickly respond to improvements (1-3) and evaluations (</w:t>
-      </w:r>
-      <w:proofErr w:type="gramStart"/>
-      <w:r>
-        <w:rPr>
-          <w:lang w:val="en-US"/>
-        </w:rPr>
-        <w:t>A,B</w:t>
-      </w:r>
-      <w:proofErr w:type="gramEnd"/>
-      <w:r>
-        <w:rPr>
-          <w:lang w:val="en-US"/>
-        </w:rPr>
-        <w:t>) and tell me feasibility</w:t>
+        <w:t>Maybe you can quickly respond to improvements (1-3) and evaluations (A,B) and tell me feasibility</w:t>
       </w:r>
       <w:r>
         <w:rPr>
@@ -1183,6 +778,11 @@
       </w:pPr>
     </w:p>
     <w:p>
+      <w:pPr>
+        <w:rPr>
+          <w:lang w:val="en-US"/>
+        </w:rPr>
+      </w:pPr>
       <w:r>
         <w:rPr>
           <w:lang w:val="en-US"/>
@@ -1211,8 +811,20 @@
         </w:r>
       </w:hyperlink>
     </w:p>
-    <w:p/>
-    <w:p/>
+    <w:p>
+      <w:pPr>
+        <w:rPr>
+          <w:lang w:val="en-US"/>
+        </w:rPr>
+      </w:pPr>
+    </w:p>
+    <w:p>
+      <w:pPr>
+        <w:rPr>
+          <w:lang w:val="en-US"/>
+        </w:rPr>
+      </w:pPr>
+    </w:p>
     <w:p>
       <w:pPr>
         <w:rPr>
@@ -1241,65 +853,7 @@
         <w:rPr>
           <w:lang w:val="en-US"/>
         </w:rPr>
-        <w:t xml:space="preserve">The </w:t>
-      </w:r>
-      <w:proofErr w:type="spellStart"/>
-      <w:r>
-        <w:rPr>
-          <w:lang w:val="en-US"/>
-        </w:rPr>
-        <w:t>LearnedSessionAdapter</w:t>
-      </w:r>
-      <w:proofErr w:type="spellEnd"/>
-      <w:r>
-        <w:rPr>
-          <w:lang w:val="en-US"/>
-        </w:rPr>
-        <w:t xml:space="preserve"> class is </w:t>
-      </w:r>
-      <w:proofErr w:type="gramStart"/>
-      <w:r>
-        <w:rPr>
-          <w:lang w:val="en-US"/>
-        </w:rPr>
-        <w:t>really helpful</w:t>
-      </w:r>
-      <w:proofErr w:type="gramEnd"/>
-      <w:r>
-        <w:rPr>
-          <w:lang w:val="en-US"/>
-        </w:rPr>
-        <w:t xml:space="preserve"> since you don’t have to retrain the whole transformer </w:t>
-      </w:r>
-      <w:proofErr w:type="spellStart"/>
-      <w:proofErr w:type="gramStart"/>
-      <w:r>
-        <w:rPr>
-          <w:lang w:val="en-US"/>
-        </w:rPr>
-        <w:t>everytime</w:t>
-      </w:r>
-      <w:proofErr w:type="spellEnd"/>
-      <w:proofErr w:type="gramEnd"/>
-      <w:r>
-        <w:rPr>
-          <w:lang w:val="en-US"/>
-        </w:rPr>
-        <w:t xml:space="preserve"> you train it on a new brain with different </w:t>
-      </w:r>
-      <w:proofErr w:type="gramStart"/>
-      <w:r>
-        <w:rPr>
-          <w:lang w:val="en-US"/>
-        </w:rPr>
-        <w:t># of neural</w:t>
-      </w:r>
-      <w:proofErr w:type="gramEnd"/>
-      <w:r>
-        <w:rPr>
-          <w:lang w:val="en-US"/>
-        </w:rPr>
-        <w:t xml:space="preserve"> data.</w:t>
+        <w:t>The LearnedSessionAdapter class is really helpful since you don’t have to retrain the whole transformer everytime you train it on a new brain with different # of neural data.</w:t>
       </w:r>
     </w:p>
     <w:p>
@@ -1317,21 +871,59 @@
         <w:rPr>
           <w:lang w:val="en-US"/>
         </w:rPr>
-        <w:t xml:space="preserve">I probably need to change way </w:t>
-      </w:r>
-      <w:proofErr w:type="gramStart"/>
-      <w:r>
-        <w:rPr>
-          <w:lang w:val="en-US"/>
-        </w:rPr>
-        <w:t>less  than</w:t>
-      </w:r>
-      <w:proofErr w:type="gramEnd"/>
-      <w:r>
-        <w:rPr>
-          <w:lang w:val="en-US"/>
-        </w:rPr>
-        <w:t xml:space="preserve"> anticipated since most of the code is Task specific anyways.</w:t>
+        <w:t>I probably need to change way less  than anticipated since most of the code is Task specific anyways.</w:t>
+      </w:r>
+    </w:p>
+    <w:p>
+      <w:pPr>
+        <w:rPr>
+          <w:lang w:val="en-US"/>
+        </w:rPr>
+      </w:pPr>
+    </w:p>
+    <w:p>
+      <w:pPr>
+        <w:rPr>
+          <w:lang w:val="en-US"/>
+        </w:rPr>
+      </w:pPr>
+    </w:p>
+    <w:p>
+      <w:pPr>
+        <w:rPr>
+          <w:lang w:val="en-US"/>
+        </w:rPr>
+      </w:pPr>
+    </w:p>
+    <w:p>
+      <w:pPr>
+        <w:rPr>
+          <w:lang w:val="en-US"/>
+        </w:rPr>
+      </w:pPr>
+      <w:r>
+        <w:rPr>
+          <w:lang w:val="en-US"/>
+        </w:rPr>
+        <w:t>11.04.2026</w:t>
+      </w:r>
+    </w:p>
+    <w:p>
+      <w:pPr>
+        <w:pStyle w:val="Listenabsatz"/>
+        <w:numPr>
+          <w:ilvl w:val="0"/>
+          <w:numId w:val="4"/>
+        </w:numPr>
+        <w:rPr>
+          <w:lang w:val="en-US"/>
+        </w:rPr>
+      </w:pPr>
+      <w:r>
+        <w:rPr>
+          <w:lang w:val="en-US"/>
+        </w:rPr>
+        <w:t>Effective parameters, per layer Embedding</w:t>
       </w:r>
     </w:p>
     <w:sectPr>
@@ -1460,6 +1052,119 @@
     </w:lvl>
   </w:abstractNum>
   <w:abstractNum w:abstractNumId="1" w15:restartNumberingAfterBreak="0">
+    <w:nsid w:val="55BA1016"/>
+    <w:multiLevelType w:val="hybridMultilevel"/>
+    <w:tmpl w:val="B5BEEF4C"/>
+    <w:lvl w:ilvl="0" w:tplc="04070001">
+      <w:start w:val="1"/>
+      <w:numFmt w:val="bullet"/>
+      <w:lvlText w:val=""/>
+      <w:lvlJc w:val="left"/>
+      <w:pPr>
+        <w:ind w:left="720" w:hanging="360"/>
+      </w:pPr>
+      <w:rPr>
+        <w:rFonts w:ascii="Symbol" w:hAnsi="Symbol" w:hint="default"/>
+      </w:rPr>
+    </w:lvl>
+    <w:lvl w:ilvl="1" w:tplc="04070003" w:tentative="1">
+      <w:start w:val="1"/>
+      <w:numFmt w:val="bullet"/>
+      <w:lvlText w:val="o"/>
+      <w:lvlJc w:val="left"/>
+      <w:pPr>
+        <w:ind w:left="1440" w:hanging="360"/>
+      </w:pPr>
+      <w:rPr>
+        <w:rFonts w:ascii="Courier New" w:hAnsi="Courier New" w:cs="Courier New" w:hint="default"/>
+      </w:rPr>
+    </w:lvl>
+    <w:lvl w:ilvl="2" w:tplc="04070005" w:tentative="1">
+      <w:start w:val="1"/>
+      <w:numFmt w:val="bullet"/>
+      <w:lvlText w:val=""/>
+      <w:lvlJc w:val="left"/>
+      <w:pPr>
+        <w:ind w:left="2160" w:hanging="360"/>
+      </w:pPr>
+      <w:rPr>
+        <w:rFonts w:ascii="Wingdings" w:hAnsi="Wingdings" w:hint="default"/>
+      </w:rPr>
+    </w:lvl>
+    <w:lvl w:ilvl="3" w:tplc="04070001" w:tentative="1">
+      <w:start w:val="1"/>
+      <w:numFmt w:val="bullet"/>
+      <w:lvlText w:val=""/>
+      <w:lvlJc w:val="left"/>
+      <w:pPr>
+        <w:ind w:left="2880" w:hanging="360"/>
+      </w:pPr>
+      <w:rPr>
+        <w:rFonts w:ascii="Symbol" w:hAnsi="Symbol" w:hint="default"/>
+      </w:rPr>
+    </w:lvl>
+    <w:lvl w:ilvl="4" w:tplc="04070003" w:tentative="1">
+      <w:start w:val="1"/>
+      <w:numFmt w:val="bullet"/>
+      <w:lvlText w:val="o"/>
+      <w:lvlJc w:val="left"/>
+      <w:pPr>
+        <w:ind w:left="3600" w:hanging="360"/>
+      </w:pPr>
+      <w:rPr>
+        <w:rFonts w:ascii="Courier New" w:hAnsi="Courier New" w:cs="Courier New" w:hint="default"/>
+      </w:rPr>
+    </w:lvl>
+    <w:lvl w:ilvl="5" w:tplc="04070005" w:tentative="1">
+      <w:start w:val="1"/>
+      <w:numFmt w:val="bullet"/>
+      <w:lvlText w:val=""/>
+      <w:lvlJc w:val="left"/>
+      <w:pPr>
+        <w:ind w:left="4320" w:hanging="360"/>
+      </w:pPr>
+      <w:rPr>
+        <w:rFonts w:ascii="Wingdings" w:hAnsi="Wingdings" w:hint="default"/>
+      </w:rPr>
+    </w:lvl>
+    <w:lvl w:ilvl="6" w:tplc="04070001" w:tentative="1">
+      <w:start w:val="1"/>
+      <w:numFmt w:val="bullet"/>
+      <w:lvlText w:val=""/>
+      <w:lvlJc w:val="left"/>
+      <w:pPr>
+        <w:ind w:left="5040" w:hanging="360"/>
+      </w:pPr>
+      <w:rPr>
+        <w:rFonts w:ascii="Symbol" w:hAnsi="Symbol" w:hint="default"/>
+      </w:rPr>
+    </w:lvl>
+    <w:lvl w:ilvl="7" w:tplc="04070003" w:tentative="1">
+      <w:start w:val="1"/>
+      <w:numFmt w:val="bullet"/>
+      <w:lvlText w:val="o"/>
+      <w:lvlJc w:val="left"/>
+      <w:pPr>
+        <w:ind w:left="5760" w:hanging="360"/>
+      </w:pPr>
+      <w:rPr>
+        <w:rFonts w:ascii="Courier New" w:hAnsi="Courier New" w:cs="Courier New" w:hint="default"/>
+      </w:rPr>
+    </w:lvl>
+    <w:lvl w:ilvl="8" w:tplc="04070005" w:tentative="1">
+      <w:start w:val="1"/>
+      <w:numFmt w:val="bullet"/>
+      <w:lvlText w:val=""/>
+      <w:lvlJc w:val="left"/>
+      <w:pPr>
+        <w:ind w:left="6480" w:hanging="360"/>
+      </w:pPr>
+      <w:rPr>
+        <w:rFonts w:ascii="Wingdings" w:hAnsi="Wingdings" w:hint="default"/>
+      </w:rPr>
+    </w:lvl>
+  </w:abstractNum>
+  <w:abstractNum w:abstractNumId="2" w15:restartNumberingAfterBreak="0">
     <w:nsid w:val="5BD71293"/>
     <w:multiLevelType w:val="hybridMultilevel"/>
     <w:tmpl w:val="849E392E"/>
@@ -1548,7 +1253,7 @@
       </w:pPr>
     </w:lvl>
   </w:abstractNum>
-  <w:abstractNum w:abstractNumId="2" w15:restartNumberingAfterBreak="0">
+  <w:abstractNum w:abstractNumId="3" w15:restartNumberingAfterBreak="0">
     <w:nsid w:val="77C75845"/>
     <w:multiLevelType w:val="hybridMultilevel"/>
     <w:tmpl w:val="0D96A816"/>
@@ -1638,13 +1343,16 @@
     </w:lvl>
   </w:abstractNum>
   <w:num w:numId="1" w16cid:durableId="965114167">
-    <w:abstractNumId w:val="2"/>
+    <w:abstractNumId w:val="3"/>
   </w:num>
   <w:num w:numId="2" w16cid:durableId="765271773">
-    <w:abstractNumId w:val="1"/>
+    <w:abstractNumId w:val="2"/>
   </w:num>
   <w:num w:numId="3" w16cid:durableId="1696231785">
     <w:abstractNumId w:val="0"/>
+  </w:num>
+  <w:num w:numId="4" w16cid:durableId="1115518989">
+    <w:abstractNumId w:val="1"/>
   </w:num>
 </w:numbering>
 </file>

</xml_diff>

<commit_message>
time update working on compute cluster
</commit_message>
<xml_diff>
--- a/documents/research log.docx
+++ b/documents/research log.docx
@@ -924,6 +924,44 @@
           <w:lang w:val="en-US"/>
         </w:rPr>
         <w:t>Effective parameters, per layer Embedding</w:t>
+      </w:r>
+    </w:p>
+    <w:p>
+      <w:pPr>
+        <w:rPr>
+          <w:lang w:val="en-US"/>
+        </w:rPr>
+      </w:pPr>
+    </w:p>
+    <w:p>
+      <w:pPr>
+        <w:rPr>
+          <w:lang w:val="en-US"/>
+        </w:rPr>
+      </w:pPr>
+      <w:r>
+        <w:rPr>
+          <w:lang w:val="en-US"/>
+        </w:rPr>
+        <w:t>13.04.2026</w:t>
+      </w:r>
+    </w:p>
+    <w:p>
+      <w:pPr>
+        <w:pStyle w:val="Listenabsatz"/>
+        <w:numPr>
+          <w:ilvl w:val="0"/>
+          <w:numId w:val="4"/>
+        </w:numPr>
+        <w:rPr>
+          <w:lang w:val="en-US"/>
+        </w:rPr>
+      </w:pPr>
+      <w:r>
+        <w:rPr>
+          <w:lang w:val="en-US"/>
+        </w:rPr>
+        <w:t>Slurm cluster etikette</w:t>
       </w:r>
     </w:p>
     <w:sectPr>
@@ -1054,7 +1092,7 @@
   <w:abstractNum w:abstractNumId="1" w15:restartNumberingAfterBreak="0">
     <w:nsid w:val="55BA1016"/>
     <w:multiLevelType w:val="hybridMultilevel"/>
-    <w:tmpl w:val="B5BEEF4C"/>
+    <w:tmpl w:val="DF100EC8"/>
     <w:lvl w:ilvl="0" w:tplc="04070001">
       <w:start w:val="1"/>
       <w:numFmt w:val="bullet"/>

</xml_diff>